<commit_message>
settings dropdown layout complete
</commit_message>
<xml_diff>
--- a/Documents/sprintBacklog.docx
+++ b/Documents/sprintBacklog.docx
@@ -454,21 +454,53 @@
     <w:p>
       <w:pPr>
         <w:pStyle w:val="Subtitle"/>
-      </w:pPr>
-      <w:r>
+        <w:rPr>
+          <w:strike/>
+        </w:rPr>
+      </w:pPr>
+      <w:r>
+        <w:rPr>
+          <w:strike/>
+        </w:rPr>
         <w:t>1</w:t>
       </w:r>
       <w:r>
+        <w:rPr>
+          <w:strike/>
+        </w:rPr>
         <w:t>5</w:t>
       </w:r>
       <w:r>
+        <w:rPr>
+          <w:strike/>
+        </w:rPr>
         <w:t xml:space="preserve">/1/2026 – </w:t>
       </w:r>
       <w:r>
+        <w:rPr>
+          <w:strike/>
+        </w:rPr>
         <w:t>29</w:t>
       </w:r>
       <w:r>
+        <w:rPr>
+          <w:strike/>
+        </w:rPr>
         <w:t>/1/2026</w:t>
+      </w:r>
+      <w:r>
+        <w:rPr>
+          <w:strike/>
+        </w:rPr>
+        <w:t xml:space="preserve"> </w:t>
+      </w:r>
+    </w:p>
+    <w:p>
+      <w:pPr>
+        <w:pStyle w:val="Subtitle"/>
+      </w:pPr>
+      <w:r>
+        <w:t>4/2/2026 – 18/2/2026</w:t>
       </w:r>
     </w:p>
     <w:p>

</xml_diff>

<commit_message>
fixed issue with double inputs for log in
</commit_message>
<xml_diff>
--- a/Documents/sprintBacklog.docx
+++ b/Documents/sprintBacklog.docx
@@ -658,7 +658,15 @@
         <w:t xml:space="preserve"> instead. </w:t>
       </w:r>
       <w:r>
-        <w:t>This means part of a later planned sprint from my gantt chart is done, so I am not too far behind because of this issue. I plan on fixing the encryption issues in the next sprint.</w:t>
+        <w:t xml:space="preserve">This means part of a later planned sprint from my </w:t>
+      </w:r>
+      <w:proofErr w:type="spellStart"/>
+      <w:r>
+        <w:t>gantt</w:t>
+      </w:r>
+      <w:proofErr w:type="spellEnd"/>
+      <w:r>
+        <w:t xml:space="preserve"> chart is done, so I am not too far behind because of this issue. I plan on fixing the encryption issues in the next sprint.</w:t>
       </w:r>
     </w:p>
     <w:p>
@@ -669,13 +677,10 @@
         </w:rPr>
       </w:pPr>
       <w:r>
-        <w:t>Sprint 4</w:t>
-      </w:r>
-      <w:r>
-        <w:rPr>
-          <w:strike/>
-        </w:rPr>
-        <w:t xml:space="preserve"> </w:t>
+        <w:t xml:space="preserve">Sprint </w:t>
+      </w:r>
+      <w:r>
+        <w:t>5</w:t>
       </w:r>
     </w:p>
     <w:p>

</xml_diff>

<commit_message>
notes with old title don't stay in local storage
</commit_message>
<xml_diff>
--- a/Documents/sprintBacklog.docx
+++ b/Documents/sprintBacklog.docx
@@ -658,15 +658,7 @@
         <w:t xml:space="preserve"> instead. </w:t>
       </w:r>
       <w:r>
-        <w:t xml:space="preserve">This means part of a later planned sprint from my </w:t>
-      </w:r>
-      <w:proofErr w:type="spellStart"/>
-      <w:r>
-        <w:t>gantt</w:t>
-      </w:r>
-      <w:proofErr w:type="spellEnd"/>
-      <w:r>
-        <w:t xml:space="preserve"> chart is done, so I am not too far behind because of this issue. I plan on fixing the encryption issues in the next sprint.</w:t>
+        <w:t>This means part of a later planned sprint from my gantt chart is done, so I am not too far behind because of this issue. I plan on fixing the encryption issues in the next sprint.</w:t>
       </w:r>
     </w:p>
     <w:p>
@@ -935,6 +927,18 @@
     </w:p>
     <w:p>
       <w:pPr>
+        <w:pStyle w:val="ListParagraph"/>
+        <w:numPr>
+          <w:ilvl w:val="0"/>
+          <w:numId w:val="1"/>
+        </w:numPr>
+      </w:pPr>
+      <w:r>
+        <w:t>Add way to pin certain notes</w:t>
+      </w:r>
+    </w:p>
+    <w:p>
+      <w:pPr>
         <w:pStyle w:val="Heading3"/>
       </w:pPr>
       <w:r>
@@ -949,7 +953,7 @@
         <w:t xml:space="preserve"> and note page will be fully functional, with files saving in </w:t>
       </w:r>
       <w:r>
-        <w:t>browser local storage and then users actual computer when chosen</w:t>
+        <w:t>browser local storage</w:t>
       </w:r>
       <w:r>
         <w:t>.</w:t>

</xml_diff>

<commit_message>
notes can be deleted now - however if you cancel delete it refreshes and clears the note
</commit_message>
<xml_diff>
--- a/Documents/sprintBacklog.docx
+++ b/Documents/sprintBacklog.docx
@@ -98,8 +98,14 @@
           <w:ilvl w:val="0"/>
           <w:numId w:val="2"/>
         </w:numPr>
-      </w:pPr>
-      <w:r>
+        <w:rPr>
+          <w:highlight w:val="green"/>
+        </w:rPr>
+      </w:pPr>
+      <w:r>
+        <w:rPr>
+          <w:highlight w:val="green"/>
+        </w:rPr>
         <w:t>Set up repository</w:t>
       </w:r>
     </w:p>
@@ -110,8 +116,14 @@
           <w:ilvl w:val="0"/>
           <w:numId w:val="2"/>
         </w:numPr>
-      </w:pPr>
-      <w:r>
+        <w:rPr>
+          <w:highlight w:val="green"/>
+        </w:rPr>
+      </w:pPr>
+      <w:r>
+        <w:rPr>
+          <w:highlight w:val="green"/>
+        </w:rPr>
         <w:t>Download extensions and required software</w:t>
       </w:r>
     </w:p>
@@ -122,8 +134,14 @@
           <w:ilvl w:val="0"/>
           <w:numId w:val="2"/>
         </w:numPr>
-      </w:pPr>
-      <w:r>
+        <w:rPr>
+          <w:highlight w:val="green"/>
+        </w:rPr>
+      </w:pPr>
+      <w:r>
+        <w:rPr>
+          <w:highlight w:val="green"/>
+        </w:rPr>
         <w:t>Create sitemap</w:t>
       </w:r>
     </w:p>
@@ -134,8 +152,14 @@
           <w:ilvl w:val="0"/>
           <w:numId w:val="2"/>
         </w:numPr>
-      </w:pPr>
-      <w:r>
+        <w:rPr>
+          <w:highlight w:val="green"/>
+        </w:rPr>
+      </w:pPr>
+      <w:r>
+        <w:rPr>
+          <w:highlight w:val="green"/>
+        </w:rPr>
         <w:t>Create base wireframe</w:t>
       </w:r>
     </w:p>
@@ -146,8 +170,14 @@
           <w:ilvl w:val="0"/>
           <w:numId w:val="2"/>
         </w:numPr>
-      </w:pPr>
-      <w:r>
+        <w:rPr>
+          <w:highlight w:val="green"/>
+        </w:rPr>
+      </w:pPr>
+      <w:r>
+        <w:rPr>
+          <w:highlight w:val="green"/>
+        </w:rPr>
         <w:t>Create individual ‘page’ wireframes</w:t>
       </w:r>
     </w:p>
@@ -251,8 +281,14 @@
           <w:ilvl w:val="0"/>
           <w:numId w:val="2"/>
         </w:numPr>
-      </w:pPr>
-      <w:r>
+        <w:rPr>
+          <w:highlight w:val="green"/>
+        </w:rPr>
+      </w:pPr>
+      <w:r>
+        <w:rPr>
+          <w:highlight w:val="green"/>
+        </w:rPr>
         <w:t>Create class diagrams</w:t>
       </w:r>
     </w:p>
@@ -263,8 +299,14 @@
           <w:ilvl w:val="0"/>
           <w:numId w:val="2"/>
         </w:numPr>
-      </w:pPr>
-      <w:r>
+        <w:rPr>
+          <w:highlight w:val="green"/>
+        </w:rPr>
+      </w:pPr>
+      <w:r>
+        <w:rPr>
+          <w:highlight w:val="green"/>
+        </w:rPr>
         <w:t>Research best encryption methods</w:t>
       </w:r>
     </w:p>
@@ -275,8 +317,14 @@
           <w:ilvl w:val="0"/>
           <w:numId w:val="2"/>
         </w:numPr>
-      </w:pPr>
-      <w:r>
+        <w:rPr>
+          <w:highlight w:val="green"/>
+        </w:rPr>
+      </w:pPr>
+      <w:r>
+        <w:rPr>
+          <w:highlight w:val="green"/>
+        </w:rPr>
         <w:t>Research best security practices</w:t>
       </w:r>
     </w:p>
@@ -287,8 +335,14 @@
           <w:ilvl w:val="0"/>
           <w:numId w:val="2"/>
         </w:numPr>
-      </w:pPr>
-      <w:r>
+        <w:rPr>
+          <w:highlight w:val="green"/>
+        </w:rPr>
+      </w:pPr>
+      <w:r>
+        <w:rPr>
+          <w:highlight w:val="green"/>
+        </w:rPr>
         <w:t>Design the security for the website</w:t>
       </w:r>
     </w:p>
@@ -389,11 +443,20 @@
           <w:ilvl w:val="0"/>
           <w:numId w:val="2"/>
         </w:numPr>
-      </w:pPr>
-      <w:r>
+        <w:rPr>
+          <w:highlight w:val="green"/>
+        </w:rPr>
+      </w:pPr>
+      <w:r>
+        <w:rPr>
+          <w:highlight w:val="green"/>
+        </w:rPr>
         <w:t>Create the s</w:t>
       </w:r>
       <w:r>
+        <w:rPr>
+          <w:highlight w:val="green"/>
+        </w:rPr>
         <w:t>lides</w:t>
       </w:r>
     </w:p>
@@ -404,8 +467,14 @@
           <w:ilvl w:val="0"/>
           <w:numId w:val="2"/>
         </w:numPr>
-      </w:pPr>
-      <w:r>
+        <w:rPr>
+          <w:highlight w:val="green"/>
+        </w:rPr>
+      </w:pPr>
+      <w:r>
+        <w:rPr>
+          <w:highlight w:val="green"/>
+        </w:rPr>
         <w:t>Record the video</w:t>
       </w:r>
     </w:p>
@@ -416,8 +485,14 @@
           <w:ilvl w:val="0"/>
           <w:numId w:val="2"/>
         </w:numPr>
-      </w:pPr>
-      <w:r>
+        <w:rPr>
+          <w:highlight w:val="green"/>
+        </w:rPr>
+      </w:pPr>
+      <w:r>
+        <w:rPr>
+          <w:highlight w:val="green"/>
+        </w:rPr>
         <w:t>Write my professional development review</w:t>
       </w:r>
     </w:p>
@@ -553,8 +628,14 @@
           <w:ilvl w:val="0"/>
           <w:numId w:val="1"/>
         </w:numPr>
-      </w:pPr>
-      <w:r>
+        <w:rPr>
+          <w:highlight w:val="green"/>
+        </w:rPr>
+      </w:pPr>
+      <w:r>
+        <w:rPr>
+          <w:highlight w:val="green"/>
+        </w:rPr>
         <w:t>Design and implement a login page, that after a successful login, opens to the home page</w:t>
       </w:r>
     </w:p>
@@ -565,8 +646,14 @@
           <w:ilvl w:val="0"/>
           <w:numId w:val="1"/>
         </w:numPr>
-      </w:pPr>
-      <w:r>
+        <w:rPr>
+          <w:highlight w:val="green"/>
+        </w:rPr>
+      </w:pPr>
+      <w:r>
+        <w:rPr>
+          <w:highlight w:val="red"/>
+        </w:rPr>
         <w:t>Securely hash and store the password</w:t>
       </w:r>
     </w:p>
@@ -577,8 +664,14 @@
           <w:ilvl w:val="0"/>
           <w:numId w:val="1"/>
         </w:numPr>
-      </w:pPr>
-      <w:r>
+        <w:rPr>
+          <w:highlight w:val="green"/>
+        </w:rPr>
+      </w:pPr>
+      <w:r>
+        <w:rPr>
+          <w:highlight w:val="green"/>
+        </w:rPr>
         <w:t>Implement the layout of the page</w:t>
       </w:r>
     </w:p>
@@ -589,11 +682,20 @@
           <w:ilvl w:val="0"/>
           <w:numId w:val="1"/>
         </w:numPr>
-      </w:pPr>
-      <w:r>
+        <w:rPr>
+          <w:highlight w:val="green"/>
+        </w:rPr>
+      </w:pPr>
+      <w:r>
+        <w:rPr>
+          <w:highlight w:val="green"/>
+        </w:rPr>
         <w:t>Add buttons</w:t>
       </w:r>
       <w:r>
+        <w:rPr>
+          <w:highlight w:val="green"/>
+        </w:rPr>
         <w:t xml:space="preserve"> to change the design (theme, font size)</w:t>
       </w:r>
     </w:p>
@@ -658,7 +760,15 @@
         <w:t xml:space="preserve"> instead. </w:t>
       </w:r>
       <w:r>
-        <w:t>This means part of a later planned sprint from my gantt chart is done, so I am not too far behind because of this issue. I plan on fixing the encryption issues in the next sprint.</w:t>
+        <w:t xml:space="preserve">This means part of a later planned sprint from my </w:t>
+      </w:r>
+      <w:proofErr w:type="spellStart"/>
+      <w:r>
+        <w:t>gantt</w:t>
+      </w:r>
+      <w:proofErr w:type="spellEnd"/>
+      <w:r>
+        <w:t xml:space="preserve"> chart is done, so I am not too far behind because of this issue. I plan on fixing the encryption issues in the next sprint.</w:t>
       </w:r>
     </w:p>
     <w:p>
@@ -746,8 +856,14 @@
           <w:ilvl w:val="0"/>
           <w:numId w:val="1"/>
         </w:numPr>
-      </w:pPr>
-      <w:r>
+        <w:rPr>
+          <w:highlight w:val="green"/>
+        </w:rPr>
+      </w:pPr>
+      <w:r>
+        <w:rPr>
+          <w:highlight w:val="green"/>
+        </w:rPr>
         <w:t>Securely hash and store the password</w:t>
       </w:r>
     </w:p>
@@ -760,6 +876,9 @@
         </w:numPr>
       </w:pPr>
       <w:r>
+        <w:rPr>
+          <w:highlight w:val="green"/>
+        </w:rPr>
         <w:t>Implement layout</w:t>
       </w:r>
     </w:p>
@@ -770,9 +889,15 @@
           <w:ilvl w:val="0"/>
           <w:numId w:val="1"/>
         </w:numPr>
-      </w:pPr>
-      <w:r>
-        <w:t>Add preview of notes</w:t>
+        <w:rPr>
+          <w:highlight w:val="green"/>
+        </w:rPr>
+      </w:pPr>
+      <w:r>
+        <w:rPr>
+          <w:highlight w:val="green"/>
+        </w:rPr>
+        <w:t>Make button to link to whole note</w:t>
       </w:r>
     </w:p>
     <w:p>
@@ -782,9 +907,105 @@
           <w:ilvl w:val="0"/>
           <w:numId w:val="1"/>
         </w:numPr>
-      </w:pPr>
-      <w:r>
-        <w:t>Make button to link to whole note</w:t>
+        <w:rPr>
+          <w:highlight w:val="green"/>
+        </w:rPr>
+      </w:pPr>
+      <w:r>
+        <w:rPr>
+          <w:highlight w:val="green"/>
+        </w:rPr>
+        <w:t>Make button that will create a new note</w:t>
+      </w:r>
+    </w:p>
+    <w:p>
+      <w:pPr>
+        <w:pStyle w:val="Heading3"/>
+      </w:pPr>
+      <w:r>
+        <w:t>Deliverables</w:t>
+      </w:r>
+    </w:p>
+    <w:p>
+      <w:r>
+        <w:t>Usernames and passwords for the log in will be hashed and stored securely</w:t>
+      </w:r>
+      <w:r>
+        <w:t>.</w:t>
+      </w:r>
+      <w:r>
+        <w:t xml:space="preserve"> The home page will be finished, with all buttons </w:t>
+      </w:r>
+      <w:r>
+        <w:t>working to an extent, as the note page will not be done yet.</w:t>
+      </w:r>
+    </w:p>
+    <w:p>
+      <w:pPr>
+        <w:pStyle w:val="Heading1"/>
+        <w:rPr>
+          <w:strike/>
+        </w:rPr>
+      </w:pPr>
+      <w:r>
+        <w:t>Sprint 6</w:t>
+      </w:r>
+    </w:p>
+    <w:p>
+      <w:pPr>
+        <w:pStyle w:val="Subtitle"/>
+      </w:pPr>
+      <w:r>
+        <w:t>4</w:t>
+      </w:r>
+      <w:r>
+        <w:t>/</w:t>
+      </w:r>
+      <w:r>
+        <w:t>3</w:t>
+      </w:r>
+      <w:r>
+        <w:t xml:space="preserve">/2026 – </w:t>
+      </w:r>
+      <w:r>
+        <w:t>18</w:t>
+      </w:r>
+      <w:r>
+        <w:t>/</w:t>
+      </w:r>
+      <w:r>
+        <w:t>3</w:t>
+      </w:r>
+      <w:r>
+        <w:t>/2026</w:t>
+      </w:r>
+    </w:p>
+    <w:p>
+      <w:pPr>
+        <w:pStyle w:val="Heading3"/>
+      </w:pPr>
+      <w:r>
+        <w:t>User Stories</w:t>
+      </w:r>
+    </w:p>
+    <w:p>
+      <w:pPr>
+        <w:pStyle w:val="ListParagraph"/>
+        <w:numPr>
+          <w:ilvl w:val="0"/>
+          <w:numId w:val="2"/>
+        </w:numPr>
+      </w:pPr>
+      <w:r>
+        <w:t>As a user, I want to be able to edit my notes and clear them</w:t>
+      </w:r>
+    </w:p>
+    <w:p>
+      <w:pPr>
+        <w:pStyle w:val="Heading3"/>
+      </w:pPr>
+      <w:r>
+        <w:t>Tasks</w:t>
       </w:r>
     </w:p>
     <w:p>
@@ -794,9 +1015,69 @@
           <w:ilvl w:val="0"/>
           <w:numId w:val="1"/>
         </w:numPr>
-      </w:pPr>
-      <w:r>
-        <w:t>Make button that will create a new note</w:t>
+        <w:rPr>
+          <w:highlight w:val="yellow"/>
+        </w:rPr>
+      </w:pPr>
+      <w:r>
+        <w:rPr>
+          <w:highlight w:val="green"/>
+        </w:rPr>
+        <w:t>Design and implement note layout</w:t>
+      </w:r>
+    </w:p>
+    <w:p>
+      <w:pPr>
+        <w:pStyle w:val="ListParagraph"/>
+        <w:numPr>
+          <w:ilvl w:val="0"/>
+          <w:numId w:val="1"/>
+        </w:numPr>
+        <w:rPr>
+          <w:highlight w:val="yellow"/>
+        </w:rPr>
+      </w:pPr>
+      <w:r>
+        <w:rPr>
+          <w:highlight w:val="yellow"/>
+        </w:rPr>
+        <w:t>Add buttons (delete, clear and save)</w:t>
+      </w:r>
+    </w:p>
+    <w:p>
+      <w:pPr>
+        <w:pStyle w:val="ListParagraph"/>
+        <w:numPr>
+          <w:ilvl w:val="0"/>
+          <w:numId w:val="1"/>
+        </w:numPr>
+        <w:rPr>
+          <w:highlight w:val="red"/>
+        </w:rPr>
+      </w:pPr>
+      <w:r>
+        <w:rPr>
+          <w:highlight w:val="red"/>
+        </w:rPr>
+        <w:t>Add ways to change design of the note (font, font colour, font size etc)</w:t>
+      </w:r>
+    </w:p>
+    <w:p>
+      <w:pPr>
+        <w:pStyle w:val="ListParagraph"/>
+        <w:numPr>
+          <w:ilvl w:val="0"/>
+          <w:numId w:val="1"/>
+        </w:numPr>
+        <w:rPr>
+          <w:highlight w:val="yellow"/>
+        </w:rPr>
+      </w:pPr>
+      <w:r>
+        <w:rPr>
+          <w:highlight w:val="yellow"/>
+        </w:rPr>
+        <w:t>Add way to pin certain notes</w:t>
       </w:r>
     </w:p>
     <w:p>
@@ -809,17 +1090,17 @@
     </w:p>
     <w:p>
       <w:r>
-        <w:t>Usernames and passwords for the log in will be hashed and stored securely</w:t>
+        <w:t>Home page will be able to link to the note page</w:t>
+      </w:r>
+      <w:r>
+        <w:t xml:space="preserve"> and note page will be fully functional, with files saving in </w:t>
+      </w:r>
+      <w:r>
+        <w:t>browser local storage</w:t>
       </w:r>
       <w:r>
         <w:t>.</w:t>
       </w:r>
-      <w:r>
-        <w:t xml:space="preserve"> The home page will be finished, with all buttons </w:t>
-      </w:r>
-      <w:r>
-        <w:t>working to an extent, as the note page will not be done yet.</w:t>
-      </w:r>
     </w:p>
     <w:p>
       <w:pPr>
@@ -829,7 +1110,7 @@
         </w:rPr>
       </w:pPr>
       <w:r>
-        <w:t>Sprint 6</w:t>
+        <w:t>Sprint 7</w:t>
       </w:r>
     </w:p>
     <w:p>
@@ -837,31 +1118,47 @@
         <w:pStyle w:val="Subtitle"/>
       </w:pPr>
       <w:r>
+        <w:t>18</w:t>
+      </w:r>
+      <w:r>
+        <w:t>/</w:t>
+      </w:r>
+      <w:r>
+        <w:t>3</w:t>
+      </w:r>
+      <w:r>
+        <w:t xml:space="preserve">/2026 – </w:t>
+      </w:r>
+      <w:r>
+        <w:t>9</w:t>
+      </w:r>
+      <w:r>
+        <w:t>/</w:t>
+      </w:r>
+      <w:r>
         <w:t>4</w:t>
       </w:r>
       <w:r>
-        <w:t>/</w:t>
-      </w:r>
-      <w:r>
-        <w:t>3</w:t>
-      </w:r>
-      <w:r>
-        <w:t xml:space="preserve">/2026 – </w:t>
-      </w:r>
-      <w:r>
-        <w:t>18</w:t>
-      </w:r>
-      <w:r>
-        <w:t>/</w:t>
-      </w:r>
-      <w:r>
-        <w:t>3</w:t>
-      </w:r>
-      <w:r>
         <w:t>/2026</w:t>
       </w:r>
     </w:p>
     <w:p>
+      <w:r>
+        <w:t xml:space="preserve">(I have work for </w:t>
+      </w:r>
+      <w:r>
+        <w:t xml:space="preserve">8 days during this </w:t>
+      </w:r>
+      <w:proofErr w:type="gramStart"/>
+      <w:r>
+        <w:t>sprint</w:t>
+      </w:r>
+      <w:proofErr w:type="gramEnd"/>
+      <w:r>
+        <w:t xml:space="preserve"> so I have made it longer)</w:t>
+      </w:r>
+    </w:p>
+    <w:p>
       <w:pPr>
         <w:pStyle w:val="Heading3"/>
       </w:pPr>
@@ -883,6 +1180,18 @@
     </w:p>
     <w:p>
       <w:pPr>
+        <w:pStyle w:val="ListParagraph"/>
+        <w:numPr>
+          <w:ilvl w:val="0"/>
+          <w:numId w:val="2"/>
+        </w:numPr>
+      </w:pPr>
+      <w:r>
+        <w:t>As a user, I want to be able to easily see all my notes and access them</w:t>
+      </w:r>
+    </w:p>
+    <w:p>
+      <w:pPr>
         <w:pStyle w:val="Heading3"/>
       </w:pPr>
       <w:r>
@@ -898,7 +1207,7 @@
         </w:numPr>
       </w:pPr>
       <w:r>
-        <w:t>Design and implement note layout</w:t>
+        <w:t>Add buttons (delete, clear)</w:t>
       </w:r>
     </w:p>
     <w:p>
@@ -908,178 +1217,14 @@
           <w:ilvl w:val="0"/>
           <w:numId w:val="1"/>
         </w:numPr>
-      </w:pPr>
-      <w:r>
-        <w:t>Add buttons (delete, clear and save)</w:t>
-      </w:r>
-    </w:p>
-    <w:p>
-      <w:pPr>
-        <w:pStyle w:val="ListParagraph"/>
-        <w:numPr>
-          <w:ilvl w:val="0"/>
-          <w:numId w:val="1"/>
-        </w:numPr>
-      </w:pPr>
-      <w:r>
-        <w:t>Add ways to change design of the note (font, font colour, font size etc)</w:t>
-      </w:r>
-    </w:p>
-    <w:p>
-      <w:pPr>
-        <w:pStyle w:val="ListParagraph"/>
-        <w:numPr>
-          <w:ilvl w:val="0"/>
-          <w:numId w:val="1"/>
-        </w:numPr>
-      </w:pPr>
-      <w:r>
-        <w:t>Add way to pin certain notes</w:t>
-      </w:r>
-    </w:p>
-    <w:p>
-      <w:pPr>
-        <w:pStyle w:val="Heading3"/>
-      </w:pPr>
-      <w:r>
-        <w:t>Deliverables</w:t>
-      </w:r>
-    </w:p>
-    <w:p>
-      <w:r>
-        <w:t>Home page will be able to link to the note page</w:t>
-      </w:r>
-      <w:r>
-        <w:t xml:space="preserve"> and note page will be fully functional, with files saving in </w:t>
-      </w:r>
-      <w:r>
-        <w:t>browser local storage</w:t>
-      </w:r>
-      <w:r>
-        <w:t>.</w:t>
-      </w:r>
-    </w:p>
-    <w:p>
-      <w:pPr>
-        <w:pStyle w:val="Heading1"/>
-        <w:rPr>
-          <w:strike/>
-        </w:rPr>
-      </w:pPr>
-      <w:r>
-        <w:t>Sprint 7</w:t>
-      </w:r>
-    </w:p>
-    <w:p>
-      <w:pPr>
-        <w:pStyle w:val="Subtitle"/>
-      </w:pPr>
-      <w:r>
-        <w:t>18</w:t>
-      </w:r>
-      <w:r>
-        <w:t>/</w:t>
-      </w:r>
-      <w:r>
-        <w:t>3</w:t>
-      </w:r>
-      <w:r>
-        <w:t xml:space="preserve">/2026 – </w:t>
-      </w:r>
-      <w:r>
-        <w:t>9</w:t>
-      </w:r>
-      <w:r>
-        <w:t>/</w:t>
-      </w:r>
-      <w:r>
-        <w:t>4</w:t>
-      </w:r>
-      <w:r>
-        <w:t>/2026</w:t>
-      </w:r>
-    </w:p>
-    <w:p>
-      <w:r>
-        <w:t xml:space="preserve">(I have work for </w:t>
-      </w:r>
-      <w:r>
-        <w:t>8 days during this sprint so I have made it longer)</w:t>
-      </w:r>
-    </w:p>
-    <w:p>
-      <w:pPr>
-        <w:pStyle w:val="Heading3"/>
-      </w:pPr>
-      <w:r>
-        <w:t>User Stories</w:t>
-      </w:r>
-    </w:p>
-    <w:p>
-      <w:pPr>
-        <w:pStyle w:val="ListParagraph"/>
-        <w:numPr>
-          <w:ilvl w:val="0"/>
-          <w:numId w:val="2"/>
-        </w:numPr>
-      </w:pPr>
-      <w:r>
-        <w:t>As a user, I want to be able to edit my notes and clear them</w:t>
-      </w:r>
-    </w:p>
-    <w:p>
-      <w:pPr>
-        <w:pStyle w:val="ListParagraph"/>
-        <w:numPr>
-          <w:ilvl w:val="0"/>
-          <w:numId w:val="2"/>
-        </w:numPr>
-      </w:pPr>
-      <w:r>
-        <w:t>As a user, I want to be able to easily see all my notes and access them</w:t>
-      </w:r>
-    </w:p>
-    <w:p>
-      <w:pPr>
-        <w:pStyle w:val="Heading3"/>
-      </w:pPr>
-      <w:r>
-        <w:t>Tasks</w:t>
-      </w:r>
-    </w:p>
-    <w:p>
-      <w:pPr>
-        <w:pStyle w:val="ListParagraph"/>
-        <w:numPr>
-          <w:ilvl w:val="0"/>
-          <w:numId w:val="1"/>
-        </w:numPr>
-      </w:pPr>
-      <w:r>
-        <w:t>Add buttons (delete, clear)</w:t>
-      </w:r>
-    </w:p>
-    <w:p>
-      <w:pPr>
-        <w:pStyle w:val="ListParagraph"/>
-        <w:numPr>
-          <w:ilvl w:val="0"/>
-          <w:numId w:val="1"/>
-        </w:numPr>
-      </w:pPr>
-      <w:r>
-        <w:t>Add ways to change design of the note (font, font colour, font size etc)</w:t>
-      </w:r>
-    </w:p>
-    <w:p>
-      <w:pPr>
-        <w:pStyle w:val="ListParagraph"/>
-        <w:numPr>
-          <w:ilvl w:val="0"/>
-          <w:numId w:val="1"/>
-        </w:numPr>
-      </w:pPr>
-      <w:r>
+        <w:rPr>
+          <w:highlight w:val="green"/>
+        </w:rPr>
+      </w:pPr>
+      <w:r>
+        <w:rPr>
+          <w:highlight w:val="green"/>
+        </w:rPr>
         <w:t>Add way to unpin note</w:t>
       </w:r>
     </w:p>
@@ -1274,7 +1419,13 @@
         <w:t>All notes will be encrypted when stored in local storage</w:t>
       </w:r>
       <w:r>
-        <w:t xml:space="preserve">, then when retrieved they’ll be unencrypted. </w:t>
+        <w:t>, then when retrieved they’ll be unencrypted.</w:t>
+      </w:r>
+    </w:p>
+    <w:p/>
+    <w:p>
+      <w:r>
+        <w:t xml:space="preserve"> </w:t>
       </w:r>
     </w:p>
     <w:sectPr>

</xml_diff>

<commit_message>
users can now log out
</commit_message>
<xml_diff>
--- a/Documents/sprintBacklog.docx
+++ b/Documents/sprintBacklog.docx
@@ -760,15 +760,7 @@
         <w:t xml:space="preserve"> instead. </w:t>
       </w:r>
       <w:r>
-        <w:t xml:space="preserve">This means part of a later planned sprint from my </w:t>
-      </w:r>
-      <w:proofErr w:type="spellStart"/>
-      <w:r>
-        <w:t>gantt</w:t>
-      </w:r>
-      <w:proofErr w:type="spellEnd"/>
-      <w:r>
-        <w:t xml:space="preserve"> chart is done, so I am not too far behind because of this issue. I plan on fixing the encryption issues in the next sprint.</w:t>
+        <w:t>This means part of a later planned sprint from my gantt chart is done, so I am not too far behind because of this issue. I plan on fixing the encryption issues in the next sprint.</w:t>
       </w:r>
     </w:p>
     <w:p>
@@ -1130,7 +1122,7 @@
         <w:t xml:space="preserve">/2026 – </w:t>
       </w:r>
       <w:r>
-        <w:t>9</w:t>
+        <w:t>1</w:t>
       </w:r>
       <w:r>
         <w:t>/</w:t>
@@ -1147,15 +1139,7 @@
         <w:t xml:space="preserve">(I have work for </w:t>
       </w:r>
       <w:r>
-        <w:t xml:space="preserve">8 days during this </w:t>
-      </w:r>
-      <w:proofErr w:type="gramStart"/>
-      <w:r>
-        <w:t>sprint</w:t>
-      </w:r>
-      <w:proofErr w:type="gramEnd"/>
-      <w:r>
-        <w:t xml:space="preserve"> so I have made it longer)</w:t>
+        <w:t>8 days during this sprint so I have made it longer)</w:t>
       </w:r>
     </w:p>
     <w:p>
@@ -1205,8 +1189,14 @@
           <w:ilvl w:val="0"/>
           <w:numId w:val="1"/>
         </w:numPr>
-      </w:pPr>
-      <w:r>
+        <w:rPr>
+          <w:highlight w:val="green"/>
+        </w:rPr>
+      </w:pPr>
+      <w:r>
+        <w:rPr>
+          <w:highlight w:val="green"/>
+        </w:rPr>
         <w:t>Add buttons (delete, clear)</w:t>
       </w:r>
     </w:p>
@@ -1294,19 +1284,19 @@
         <w:pStyle w:val="Subtitle"/>
       </w:pPr>
       <w:r>
-        <w:t>9</w:t>
+        <w:t>1</w:t>
       </w:r>
       <w:r>
         <w:t>/</w:t>
       </w:r>
       <w:r>
-        <w:t>3</w:t>
+        <w:t>4</w:t>
       </w:r>
       <w:r>
         <w:t xml:space="preserve">/2026 – </w:t>
       </w:r>
       <w:r>
-        <w:t>22</w:t>
+        <w:t>15</w:t>
       </w:r>
       <w:r>
         <w:t>/</w:t>
@@ -1424,8 +1414,147 @@
     </w:p>
     <w:p/>
     <w:p>
+      <w:pPr>
+        <w:pStyle w:val="Heading1"/>
+        <w:rPr>
+          <w:strike/>
+        </w:rPr>
+      </w:pPr>
       <w:r>
         <w:t xml:space="preserve"> </w:t>
+      </w:r>
+      <w:r>
+        <w:t xml:space="preserve">Sprint </w:t>
+      </w:r>
+      <w:r>
+        <w:t>8</w:t>
+      </w:r>
+    </w:p>
+    <w:p>
+      <w:pPr>
+        <w:pStyle w:val="Subtitle"/>
+      </w:pPr>
+      <w:r>
+        <w:t>15</w:t>
+      </w:r>
+      <w:r>
+        <w:t>/</w:t>
+      </w:r>
+      <w:r>
+        <w:t>4</w:t>
+      </w:r>
+      <w:r>
+        <w:t xml:space="preserve">/2026 – </w:t>
+      </w:r>
+      <w:r>
+        <w:t>29</w:t>
+      </w:r>
+      <w:r>
+        <w:t>/</w:t>
+      </w:r>
+      <w:r>
+        <w:t>4</w:t>
+      </w:r>
+      <w:r>
+        <w:t>/2026</w:t>
+      </w:r>
+    </w:p>
+    <w:p>
+      <w:pPr>
+        <w:pStyle w:val="Heading3"/>
+      </w:pPr>
+      <w:r>
+        <w:t>User Stories</w:t>
+      </w:r>
+    </w:p>
+    <w:p>
+      <w:pPr>
+        <w:pStyle w:val="ListParagraph"/>
+        <w:numPr>
+          <w:ilvl w:val="0"/>
+          <w:numId w:val="2"/>
+        </w:numPr>
+      </w:pPr>
+      <w:r>
+        <w:t xml:space="preserve">As a </w:t>
+      </w:r>
+      <w:r>
+        <w:t>developer, I want all notes stored in their own file</w:t>
+      </w:r>
+    </w:p>
+    <w:p>
+      <w:pPr>
+        <w:pStyle w:val="Heading3"/>
+      </w:pPr>
+      <w:r>
+        <w:t>Tasks</w:t>
+      </w:r>
+    </w:p>
+    <w:p>
+      <w:pPr>
+        <w:pStyle w:val="ListParagraph"/>
+        <w:numPr>
+          <w:ilvl w:val="0"/>
+          <w:numId w:val="1"/>
+        </w:numPr>
+      </w:pPr>
+      <w:r>
+        <w:t xml:space="preserve">Store all notes in their own </w:t>
+      </w:r>
+      <w:r>
+        <w:t>JSON</w:t>
+      </w:r>
+      <w:r>
+        <w:t xml:space="preserve"> file</w:t>
+      </w:r>
+    </w:p>
+    <w:p>
+      <w:pPr>
+        <w:pStyle w:val="ListParagraph"/>
+        <w:numPr>
+          <w:ilvl w:val="0"/>
+          <w:numId w:val="1"/>
+        </w:numPr>
+      </w:pPr>
+      <w:r>
+        <w:t>Each file has a preview section</w:t>
+      </w:r>
+    </w:p>
+    <w:p>
+      <w:pPr>
+        <w:pStyle w:val="ListParagraph"/>
+        <w:numPr>
+          <w:ilvl w:val="0"/>
+          <w:numId w:val="1"/>
+        </w:numPr>
+      </w:pPr>
+      <w:r>
+        <w:t>Data is taken from the note page</w:t>
+      </w:r>
+    </w:p>
+    <w:p>
+      <w:pPr>
+        <w:pStyle w:val="ListParagraph"/>
+        <w:numPr>
+          <w:ilvl w:val="0"/>
+          <w:numId w:val="1"/>
+        </w:numPr>
+      </w:pPr>
+      <w:r>
+        <w:t>Each file has information on how it should be displayed</w:t>
+      </w:r>
+    </w:p>
+    <w:p>
+      <w:pPr>
+        <w:pStyle w:val="Heading3"/>
+      </w:pPr>
+      <w:r>
+        <w:t>Deliverables</w:t>
+      </w:r>
+    </w:p>
+    <w:p>
+      <w:r>
+        <w:t>All notes will be stored in a json file on users computer</w:t>
       </w:r>
     </w:p>
     <w:sectPr>

</xml_diff>

<commit_message>
notes now have a preview
</commit_message>
<xml_diff>
--- a/Documents/sprintBacklog.docx
+++ b/Documents/sprintBacklog.docx
@@ -760,7 +760,15 @@
         <w:t xml:space="preserve"> instead. </w:t>
       </w:r>
       <w:r>
-        <w:t>This means part of a later planned sprint from my gantt chart is done, so I am not too far behind because of this issue. I plan on fixing the encryption issues in the next sprint.</w:t>
+        <w:t xml:space="preserve">This means part of a later planned sprint from my </w:t>
+      </w:r>
+      <w:proofErr w:type="spellStart"/>
+      <w:r>
+        <w:t>gantt</w:t>
+      </w:r>
+      <w:proofErr w:type="spellEnd"/>
+      <w:r>
+        <w:t xml:space="preserve"> chart is done, so I am not too far behind because of this issue. I plan on fixing the encryption issues in the next sprint.</w:t>
       </w:r>
     </w:p>
     <w:p>
@@ -1139,7 +1147,15 @@
         <w:t xml:space="preserve">(I have work for </w:t>
       </w:r>
       <w:r>
-        <w:t>8 days during this sprint so I have made it longer)</w:t>
+        <w:t xml:space="preserve">8 days during this </w:t>
+      </w:r>
+      <w:proofErr w:type="gramStart"/>
+      <w:r>
+        <w:t>sprint</w:t>
+      </w:r>
+      <w:proofErr w:type="gramEnd"/>
+      <w:r>
+        <w:t xml:space="preserve"> so I have made it longer)</w:t>
       </w:r>
     </w:p>
     <w:p>
@@ -1225,8 +1241,14 @@
           <w:ilvl w:val="0"/>
           <w:numId w:val="1"/>
         </w:numPr>
-      </w:pPr>
-      <w:r>
+        <w:rPr>
+          <w:highlight w:val="green"/>
+        </w:rPr>
+      </w:pPr>
+      <w:r>
+        <w:rPr>
+          <w:highlight w:val="green"/>
+        </w:rPr>
         <w:t>Button for user to log out</w:t>
       </w:r>
     </w:p>
@@ -1424,10 +1446,7 @@
         <w:t xml:space="preserve"> </w:t>
       </w:r>
       <w:r>
-        <w:t xml:space="preserve">Sprint </w:t>
-      </w:r>
-      <w:r>
-        <w:t>8</w:t>
+        <w:t>Sprint 8</w:t>
       </w:r>
     </w:p>
     <w:p>
@@ -1499,13 +1518,7 @@
         </w:numPr>
       </w:pPr>
       <w:r>
-        <w:t xml:space="preserve">Store all notes in their own </w:t>
-      </w:r>
-      <w:r>
-        <w:t>JSON</w:t>
-      </w:r>
-      <w:r>
-        <w:t xml:space="preserve"> file</w:t>
+        <w:t>Store all notes in their own JSON file</w:t>
       </w:r>
     </w:p>
     <w:p>
@@ -1554,7 +1567,23 @@
     </w:p>
     <w:p>
       <w:r>
-        <w:t>All notes will be stored in a json file on users computer</w:t>
+        <w:t xml:space="preserve">All notes will be stored in a </w:t>
+      </w:r>
+      <w:proofErr w:type="spellStart"/>
+      <w:r>
+        <w:t>json</w:t>
+      </w:r>
+      <w:proofErr w:type="spellEnd"/>
+      <w:r>
+        <w:t xml:space="preserve"> file on </w:t>
+      </w:r>
+      <w:proofErr w:type="gramStart"/>
+      <w:r>
+        <w:t>users</w:t>
+      </w:r>
+      <w:proofErr w:type="gramEnd"/>
+      <w:r>
+        <w:t xml:space="preserve"> computer</w:t>
       </w:r>
     </w:p>
     <w:sectPr>

</xml_diff>